<commit_message>
add observability, governance, and evaluation framework
</commit_message>
<xml_diff>
--- a/BVRITH_chatbot/data/college_kb.docx
+++ b/BVRITH_chatbot/data/college_kb.docx
@@ -401,7 +401,19 @@
         <w:spacing w:after="80"/>
       </w:pPr>
       <w:r>
-        <w:t>Excellent Placement Records. Highest Package being offered in Amazon with 29.9 Lakh</w:t>
+        <w:t>Excellent Placement Records. Highest Package being offered in A</w:t>
+      </w:r>
+      <w:r>
+        <w:t>dobe</w:t>
+      </w:r>
+      <w:r>
+        <w:t xml:space="preserve"> with </w:t>
+      </w:r>
+      <w:r>
+        <w:t>54</w:t>
+      </w:r>
+      <w:r>
+        <w:t xml:space="preserve"> Lakh</w:t>
       </w:r>
     </w:p>
     <w:p>
@@ -417,7 +429,13 @@
         <w:spacing w:after="80"/>
       </w:pPr>
       <w:r>
-        <w:t>When the whole society is focusing on diversity in every field then BVRITH is like a stone on the pillar to motivate and groom those aspiring women who want to make a mark in the society.</w:t>
+        <w:t>When the whole society is focusing on diversity in every field then BVRITH is like a stone on the pillar to motivate and groom those aspiring w</w:t>
+      </w:r>
+      <w:r>
+        <w:t>pla</w:t>
+      </w:r>
+      <w:r>
+        <w:t>omen who want to make a mark in the society.</w:t>
       </w:r>
     </w:p>
     <w:p>
@@ -31534,7 +31552,13 @@
         <w:spacing w:after="80"/>
       </w:pPr>
       <w:r>
-        <w:t>CSE: 228 eligible, 205 placed (89.9%), highest package Rs.24.0 LPA, average Rs.6.2 LPA</w:t>
+        <w:t>CSE: 228 eligible, 205 placed (89.9%), highest package Rs.</w:t>
+      </w:r>
+      <w:r>
+        <w:t>5</w:t>
+      </w:r>
+      <w:r>
+        <w:t>4.0 LPA, average Rs.6.2 LPA</w:t>
       </w:r>
     </w:p>
     <w:p>
@@ -31559,14 +31583,6 @@
         <w:spacing w:after="80"/>
       </w:pPr>
       <w:r>
-        <w:t>Mechanical: 52 eligible, 35 placed (67.3%), highest Rs.10.5 LPA, average Rs.4.0 LPA</w:t>
-      </w:r>
-    </w:p>
-    <w:p>
-      <w:pPr>
-        <w:spacing w:after="80"/>
-      </w:pPr>
-      <w:r>
         <w:t>IT: 168 eligible, 147 placed (87.5%), highest Rs.21.0 LPA, average Rs.5.8 LPA</w:t>
       </w:r>
     </w:p>
@@ -31575,15 +31591,13 @@
         <w:spacing w:after="80"/>
       </w:pPr>
       <w:r>
-        <w:t>CSE (AI&amp;ML): 105 eligible, 89 placed (84.8%), highest Rs.22.0 LPA, average Rs.6.5 LPA</w:t>
-      </w:r>
-    </w:p>
-    <w:p>
-      <w:pPr>
-        <w:spacing w:after="80"/>
-      </w:pPr>
-      <w:r>
-        <w:t>CSE (Data Science): 102 eligible, 85 placed (83.3%), highest Rs.20.0 LPA, average Rs.6.0 LPA</w:t>
+        <w:t>CSE (AI&amp;ML): 105 eligible, 89 placed (84.8%), highest Rs.</w:t>
+      </w:r>
+      <w:r>
+        <w:t>52</w:t>
+      </w:r>
+      <w:r>
+        <w:t xml:space="preserve"> LPA, average Rs.6.5 LPA</w:t>
       </w:r>
     </w:p>
     <w:p>
@@ -31699,6 +31713,7 @@
         <w:rPr>
           <w:color w:val="003366"/>
         </w:rPr>
+        <w:lastRenderedPageBreak/>
         <w:t>15.8 Medical &amp; Wellness (Illustrative)</w:t>
       </w:r>
     </w:p>
@@ -31814,14 +31829,14 @@
         <w:rPr>
           <w:i/>
         </w:rPr>
-        <w:t xml:space="preserve">The illustrative document names a Principal, Vice-Principal, Dean (Academics), Dean (Student Affairs), Training &amp; Placement Officer, and a Head of Department for each of the seven </w:t>
+        <w:t xml:space="preserve">The illustrative document names a Principal, Vice-Principal, Dean (Academics), Dean (Student Affairs), Training &amp; Placement Officer, and a Head of Department for each of the seven programmes, each with a qualification and research area. These names conflict with (or </w:t>
       </w:r>
       <w:r>
         <w:rPr>
           <w:i/>
         </w:rPr>
         <w:lastRenderedPageBreak/>
-        <w:t>programmes, each with a qualification and research area. These names conflict with (or simply are not confirmable against) the leadership and department-head names in this knowledge base's Management, Principal, and CSE/ECE/EEE/IT department sections above, so they are intentionally not reproduced here to avoid introducing incorrect personnel names into a real knowledge base. Please rely on the names already listed earlier in this document, or verify current office-holders directly with the college.</w:t>
+        <w:t>simply are not confirmable against) the leadership and department-head names in this knowledge base's Management, Principal, and CSE/ECE/EEE/IT department sections above, so they are intentionally not reproduced here to avoid introducing incorrect personnel names into a real knowledge base. Please rely on the names already listed earlier in this document, or verify current office-holders directly with the college.</w:t>
       </w:r>
     </w:p>
     <w:p/>

</xml_diff>